<commit_message>
Step 7: add a methods note to the report appendix
The report carried no methods text, so a reader had no way to know what
defined the modeled extent. The note states the buffered-GAP definition,
derives the 250 km figure from Huang, Sauer & Dubayah (2017), clarifies
that range statistics still use the unbuffered polygon, describes the
buffer-ring statistic, and records the permanent-resident limitation.
appendix now takes a vector so it precedes the variables reference, whose
title drops a version number that would go stale each release.

Co-Authored-By: Claude Opus 5 <noreply@anthropic.com>
</commit_message>
<xml_diff>
--- a/inst/resources/variables.docx
+++ b/inst/resources/variables.docx
@@ -52,47 +52,7 @@
                 <w:sz w:val="21"/>
                 <w:szCs w:val="21"/>
               </w:rPr>
-              <w:t>MERRA-2 and MERRAclim-2 variables</w:t>
-            </w:r>
-            <w:r>
-              <w:rPr>
-                <w:rFonts w:ascii="Times New Roman" w:hAnsi="Times New Roman" w:cs="Times New Roman"/>
-                <w:b/>
-                <w:bCs/>
-                <w:sz w:val="21"/>
-                <w:szCs w:val="21"/>
-              </w:rPr>
-              <w:t xml:space="preserve"> in the</w:t>
-            </w:r>
-            <w:r>
-              <w:rPr>
-                <w:rFonts w:ascii="Times New Roman" w:hAnsi="Times New Roman" w:cs="Times New Roman"/>
-                <w:b/>
-                <w:bCs/>
-                <w:sz w:val="21"/>
-                <w:szCs w:val="21"/>
-              </w:rPr>
-              <w:t xml:space="preserve"> v0.1.0 </w:t>
-            </w:r>
-            <w:r>
-              <w:rPr>
-                <w:rFonts w:ascii="Times New Roman" w:hAnsi="Times New Roman" w:cs="Times New Roman"/>
-                <w:b/>
-                <w:bCs/>
-                <w:sz w:val="21"/>
-                <w:szCs w:val="21"/>
-              </w:rPr>
-              <w:t>extended dataset</w:t>
-            </w:r>
-            <w:r>
-              <w:rPr>
-                <w:rFonts w:ascii="Times New Roman" w:hAnsi="Times New Roman" w:cs="Times New Roman"/>
-                <w:b/>
-                <w:bCs/>
-                <w:sz w:val="21"/>
-                <w:szCs w:val="21"/>
-              </w:rPr>
-              <w:t>.</w:t>
+              <w:t xml:space="preserve">MERRA-2 and MERRAclim-2 variables in the extended dataset.</w:t>
             </w:r>
           </w:p>
         </w:tc>
@@ -287,7 +247,6 @@
                 <w14:ligatures w14:val="none"/>
               </w:rPr>
             </w:pPr>
-            <w:proofErr w:type="spellStart"/>
             <w:r>
               <w:rPr>
                 <w:rFonts w:ascii="Times New Roman" w:eastAsia="Times New Roman" w:hAnsi="Times New Roman" w:cs="Times New Roman"/>
@@ -299,7 +258,6 @@
               </w:rPr>
               <w:t>cldtot</w:t>
             </w:r>
-            <w:proofErr w:type="spellEnd"/>
           </w:p>
         </w:tc>
         <w:tc>
@@ -371,7 +329,6 @@
                 <w14:ligatures w14:val="none"/>
               </w:rPr>
             </w:pPr>
-            <w:proofErr w:type="spellStart"/>
             <w:r>
               <w:rPr>
                 <w:rFonts w:ascii="Times New Roman" w:eastAsia="Times New Roman" w:hAnsi="Times New Roman" w:cs="Times New Roman"/>
@@ -383,7 +340,6 @@
               </w:rPr>
               <w:t>echange</w:t>
             </w:r>
-            <w:proofErr w:type="spellEnd"/>
           </w:p>
         </w:tc>
         <w:tc>
@@ -455,7 +411,6 @@
                 <w14:ligatures w14:val="none"/>
               </w:rPr>
             </w:pPr>
-            <w:proofErr w:type="spellStart"/>
             <w:r>
               <w:rPr>
                 <w:rFonts w:ascii="Times New Roman" w:eastAsia="Times New Roman" w:hAnsi="Times New Roman" w:cs="Times New Roman"/>
@@ -467,7 +422,6 @@
               </w:rPr>
               <w:t>eflux</w:t>
             </w:r>
-            <w:proofErr w:type="spellEnd"/>
           </w:p>
         </w:tc>
         <w:tc>
@@ -539,7 +493,6 @@
                 <w14:ligatures w14:val="none"/>
               </w:rPr>
             </w:pPr>
-            <w:proofErr w:type="spellStart"/>
             <w:r>
               <w:rPr>
                 <w:rFonts w:ascii="Times New Roman" w:eastAsia="Times New Roman" w:hAnsi="Times New Roman" w:cs="Times New Roman"/>
@@ -551,7 +504,6 @@
               </w:rPr>
               <w:t>evland</w:t>
             </w:r>
-            <w:proofErr w:type="spellEnd"/>
           </w:p>
         </w:tc>
         <w:tc>
@@ -623,7 +575,6 @@
                 <w14:ligatures w14:val="none"/>
               </w:rPr>
             </w:pPr>
-            <w:proofErr w:type="spellStart"/>
             <w:r>
               <w:rPr>
                 <w:rFonts w:ascii="Times New Roman" w:eastAsia="Times New Roman" w:hAnsi="Times New Roman" w:cs="Times New Roman"/>
@@ -635,7 +586,6 @@
               </w:rPr>
               <w:t>evpintr</w:t>
             </w:r>
-            <w:proofErr w:type="spellEnd"/>
           </w:p>
         </w:tc>
         <w:tc>
@@ -707,7 +657,6 @@
                 <w14:ligatures w14:val="none"/>
               </w:rPr>
             </w:pPr>
-            <w:proofErr w:type="spellStart"/>
             <w:r>
               <w:rPr>
                 <w:rFonts w:ascii="Times New Roman" w:eastAsia="Times New Roman" w:hAnsi="Times New Roman" w:cs="Times New Roman"/>
@@ -719,7 +668,6 @@
               </w:rPr>
               <w:t>evpsoil</w:t>
             </w:r>
-            <w:proofErr w:type="spellEnd"/>
           </w:p>
         </w:tc>
         <w:tc>
@@ -873,7 +821,6 @@
                 <w14:ligatures w14:val="none"/>
               </w:rPr>
             </w:pPr>
-            <w:proofErr w:type="spellStart"/>
             <w:r>
               <w:rPr>
                 <w:rFonts w:ascii="Times New Roman" w:eastAsia="Times New Roman" w:hAnsi="Times New Roman" w:cs="Times New Roman"/>
@@ -885,7 +832,6 @@
               </w:rPr>
               <w:t>frwlt</w:t>
             </w:r>
-            <w:proofErr w:type="spellEnd"/>
           </w:p>
         </w:tc>
         <w:tc>
@@ -957,7 +903,6 @@
                 <w14:ligatures w14:val="none"/>
               </w:rPr>
             </w:pPr>
-            <w:proofErr w:type="spellStart"/>
             <w:r>
               <w:rPr>
                 <w:rFonts w:ascii="Times New Roman" w:eastAsia="Times New Roman" w:hAnsi="Times New Roman" w:cs="Times New Roman"/>
@@ -969,7 +914,6 @@
               </w:rPr>
               <w:t>ghland</w:t>
             </w:r>
-            <w:proofErr w:type="spellEnd"/>
           </w:p>
         </w:tc>
         <w:tc>
@@ -1041,7 +985,6 @@
                 <w14:ligatures w14:val="none"/>
               </w:rPr>
             </w:pPr>
-            <w:proofErr w:type="spellStart"/>
             <w:r>
               <w:rPr>
                 <w:rFonts w:ascii="Times New Roman" w:eastAsia="Times New Roman" w:hAnsi="Times New Roman" w:cs="Times New Roman"/>
@@ -1053,7 +996,6 @@
               </w:rPr>
               <w:t>grn</w:t>
             </w:r>
-            <w:proofErr w:type="spellEnd"/>
           </w:p>
         </w:tc>
         <w:tc>
@@ -1125,7 +1067,6 @@
                 <w14:ligatures w14:val="none"/>
               </w:rPr>
             </w:pPr>
-            <w:proofErr w:type="spellStart"/>
             <w:r>
               <w:rPr>
                 <w:rFonts w:ascii="Times New Roman" w:eastAsia="Times New Roman" w:hAnsi="Times New Roman" w:cs="Times New Roman"/>
@@ -1137,7 +1078,6 @@
               </w:rPr>
               <w:t>gwetprof</w:t>
             </w:r>
-            <w:proofErr w:type="spellEnd"/>
           </w:p>
         </w:tc>
         <w:tc>
@@ -1209,7 +1149,6 @@
                 <w14:ligatures w14:val="none"/>
               </w:rPr>
             </w:pPr>
-            <w:proofErr w:type="spellStart"/>
             <w:r>
               <w:rPr>
                 <w:rFonts w:ascii="Times New Roman" w:eastAsia="Times New Roman" w:hAnsi="Times New Roman" w:cs="Times New Roman"/>
@@ -1221,7 +1160,6 @@
               </w:rPr>
               <w:t>gwetroot</w:t>
             </w:r>
-            <w:proofErr w:type="spellEnd"/>
           </w:p>
         </w:tc>
         <w:tc>
@@ -1293,7 +1231,6 @@
                 <w14:ligatures w14:val="none"/>
               </w:rPr>
             </w:pPr>
-            <w:proofErr w:type="spellStart"/>
             <w:r>
               <w:rPr>
                 <w:rFonts w:ascii="Times New Roman" w:eastAsia="Times New Roman" w:hAnsi="Times New Roman" w:cs="Times New Roman"/>
@@ -1305,7 +1242,6 @@
               </w:rPr>
               <w:t>hflux</w:t>
             </w:r>
-            <w:proofErr w:type="spellEnd"/>
           </w:p>
         </w:tc>
         <w:tc>
@@ -1459,7 +1395,6 @@
                 <w14:ligatures w14:val="none"/>
               </w:rPr>
             </w:pPr>
-            <w:proofErr w:type="spellStart"/>
             <w:r>
               <w:rPr>
                 <w:rFonts w:ascii="Times New Roman" w:eastAsia="Times New Roman" w:hAnsi="Times New Roman" w:cs="Times New Roman"/>
@@ -1471,7 +1406,6 @@
               </w:rPr>
               <w:t>lwgnt</w:t>
             </w:r>
-            <w:proofErr w:type="spellEnd"/>
           </w:p>
         </w:tc>
         <w:tc>
@@ -1543,7 +1477,6 @@
                 <w14:ligatures w14:val="none"/>
               </w:rPr>
             </w:pPr>
-            <w:proofErr w:type="spellStart"/>
             <w:r>
               <w:rPr>
                 <w:rFonts w:ascii="Times New Roman" w:eastAsia="Times New Roman" w:hAnsi="Times New Roman" w:cs="Times New Roman"/>
@@ -1555,7 +1488,6 @@
               </w:rPr>
               <w:t>prectotcorr</w:t>
             </w:r>
-            <w:proofErr w:type="spellEnd"/>
           </w:p>
         </w:tc>
         <w:tc>
@@ -1627,7 +1559,6 @@
                 <w14:ligatures w14:val="none"/>
               </w:rPr>
             </w:pPr>
-            <w:proofErr w:type="spellStart"/>
             <w:r>
               <w:rPr>
                 <w:rFonts w:ascii="Times New Roman" w:eastAsia="Times New Roman" w:hAnsi="Times New Roman" w:cs="Times New Roman"/>
@@ -1639,7 +1570,6 @@
               </w:rPr>
               <w:t>prevtot</w:t>
             </w:r>
-            <w:proofErr w:type="spellEnd"/>
           </w:p>
         </w:tc>
         <w:tc>
@@ -1711,7 +1641,6 @@
                 <w14:ligatures w14:val="none"/>
               </w:rPr>
             </w:pPr>
-            <w:proofErr w:type="spellStart"/>
             <w:r>
               <w:rPr>
                 <w:rFonts w:ascii="Times New Roman" w:eastAsia="Times New Roman" w:hAnsi="Times New Roman" w:cs="Times New Roman"/>
@@ -1723,7 +1652,6 @@
               </w:rPr>
               <w:t>prmc</w:t>
             </w:r>
-            <w:proofErr w:type="spellEnd"/>
           </w:p>
         </w:tc>
         <w:tc>
@@ -1795,7 +1723,6 @@
                 <w14:ligatures w14:val="none"/>
               </w:rPr>
             </w:pPr>
-            <w:proofErr w:type="spellStart"/>
             <w:r>
               <w:rPr>
                 <w:rFonts w:ascii="Times New Roman" w:eastAsia="Times New Roman" w:hAnsi="Times New Roman" w:cs="Times New Roman"/>
@@ -1807,7 +1734,6 @@
               </w:rPr>
               <w:t>qinfil</w:t>
             </w:r>
-            <w:proofErr w:type="spellEnd"/>
           </w:p>
         </w:tc>
         <w:tc>
@@ -1961,7 +1887,6 @@
                 <w14:ligatures w14:val="none"/>
               </w:rPr>
             </w:pPr>
-            <w:proofErr w:type="spellStart"/>
             <w:r>
               <w:rPr>
                 <w:rFonts w:ascii="Times New Roman" w:eastAsia="Times New Roman" w:hAnsi="Times New Roman" w:cs="Times New Roman"/>
@@ -1973,7 +1898,6 @@
               </w:rPr>
               <w:t>rzmc</w:t>
             </w:r>
-            <w:proofErr w:type="spellEnd"/>
           </w:p>
         </w:tc>
         <w:tc>
@@ -2127,7 +2051,6 @@
                 <w14:ligatures w14:val="none"/>
               </w:rPr>
             </w:pPr>
-            <w:proofErr w:type="spellStart"/>
             <w:r>
               <w:rPr>
                 <w:rFonts w:ascii="Times New Roman" w:eastAsia="Times New Roman" w:hAnsi="Times New Roman" w:cs="Times New Roman"/>
@@ -2139,7 +2062,6 @@
               </w:rPr>
               <w:t>swgnt</w:t>
             </w:r>
-            <w:proofErr w:type="spellEnd"/>
           </w:p>
         </w:tc>
         <w:tc>
@@ -2293,7 +2215,6 @@
                 <w14:ligatures w14:val="none"/>
               </w:rPr>
             </w:pPr>
-            <w:proofErr w:type="spellStart"/>
             <w:r>
               <w:rPr>
                 <w:rFonts w:ascii="Times New Roman" w:eastAsia="Times New Roman" w:hAnsi="Times New Roman" w:cs="Times New Roman"/>
@@ -2305,7 +2226,6 @@
               </w:rPr>
               <w:t>tautot</w:t>
             </w:r>
-            <w:proofErr w:type="spellEnd"/>
           </w:p>
         </w:tc>
         <w:tc>
@@ -2377,7 +2297,6 @@
                 <w14:ligatures w14:val="none"/>
               </w:rPr>
             </w:pPr>
-            <w:proofErr w:type="spellStart"/>
             <w:r>
               <w:rPr>
                 <w:rFonts w:ascii="Times New Roman" w:eastAsia="Times New Roman" w:hAnsi="Times New Roman" w:cs="Times New Roman"/>
@@ -2389,7 +2308,6 @@
               </w:rPr>
               <w:t>ts</w:t>
             </w:r>
-            <w:proofErr w:type="spellEnd"/>
           </w:p>
         </w:tc>
         <w:tc>
@@ -2461,7 +2379,6 @@
                 <w14:ligatures w14:val="none"/>
               </w:rPr>
             </w:pPr>
-            <w:proofErr w:type="spellStart"/>
             <w:r>
               <w:rPr>
                 <w:rFonts w:ascii="Times New Roman" w:eastAsia="Times New Roman" w:hAnsi="Times New Roman" w:cs="Times New Roman"/>
@@ -2473,7 +2390,6 @@
               </w:rPr>
               <w:t>tsat</w:t>
             </w:r>
-            <w:proofErr w:type="spellEnd"/>
           </w:p>
         </w:tc>
         <w:tc>
@@ -2545,7 +2461,6 @@
                 <w14:ligatures w14:val="none"/>
               </w:rPr>
             </w:pPr>
-            <w:proofErr w:type="spellStart"/>
             <w:r>
               <w:rPr>
                 <w:rFonts w:ascii="Times New Roman" w:eastAsia="Times New Roman" w:hAnsi="Times New Roman" w:cs="Times New Roman"/>
@@ -2557,7 +2472,6 @@
               </w:rPr>
               <w:t>tsurf</w:t>
             </w:r>
-            <w:proofErr w:type="spellEnd"/>
           </w:p>
         </w:tc>
         <w:tc>
@@ -2629,7 +2543,6 @@
                 <w14:ligatures w14:val="none"/>
               </w:rPr>
             </w:pPr>
-            <w:proofErr w:type="spellStart"/>
             <w:r>
               <w:rPr>
                 <w:rFonts w:ascii="Times New Roman" w:eastAsia="Times New Roman" w:hAnsi="Times New Roman" w:cs="Times New Roman"/>
@@ -2641,7 +2554,6 @@
               </w:rPr>
               <w:t>wchange</w:t>
             </w:r>
-            <w:proofErr w:type="spellEnd"/>
           </w:p>
         </w:tc>
         <w:tc>
@@ -2739,59 +2651,7 @@
                 <w:szCs w:val="20"/>
                 <w14:ligatures w14:val="none"/>
               </w:rPr>
-              <w:t>MERRA</w:t>
-            </w:r>
-            <w:r>
-              <w:rPr>
-                <w:rFonts w:ascii="Times New Roman" w:eastAsia="Times New Roman" w:hAnsi="Times New Roman" w:cs="Times New Roman"/>
-                <w:b/>
-                <w:bCs/>
-                <w:color w:val="000000"/>
-                <w:kern w:val="0"/>
-                <w:sz w:val="20"/>
-                <w:szCs w:val="20"/>
-                <w14:ligatures w14:val="none"/>
-              </w:rPr>
-              <w:t>clim</w:t>
-            </w:r>
-            <w:r>
-              <w:rPr>
-                <w:rFonts w:ascii="Times New Roman" w:eastAsia="Times New Roman" w:hAnsi="Times New Roman" w:cs="Times New Roman"/>
-                <w:b/>
-                <w:bCs/>
-                <w:color w:val="000000"/>
-                <w:kern w:val="0"/>
-                <w:sz w:val="20"/>
-                <w:szCs w:val="20"/>
-                <w14:ligatures w14:val="none"/>
-              </w:rPr>
-              <w:t>-2 (M</w:t>
-            </w:r>
-            <w:r>
-              <w:rPr>
-                <w:rFonts w:ascii="Times New Roman" w:eastAsia="Times New Roman" w:hAnsi="Times New Roman" w:cs="Times New Roman"/>
-                <w:b/>
-                <w:bCs/>
-                <w:color w:val="000000"/>
-                <w:kern w:val="0"/>
-                <w:sz w:val="20"/>
-                <w:szCs w:val="20"/>
-                <w14:ligatures w14:val="none"/>
-              </w:rPr>
-              <w:t>C</w:t>
-            </w:r>
-            <w:r>
-              <w:rPr>
-                <w:rFonts w:ascii="Times New Roman" w:eastAsia="Times New Roman" w:hAnsi="Times New Roman" w:cs="Times New Roman"/>
-                <w:b/>
-                <w:bCs/>
-                <w:color w:val="000000"/>
-                <w:kern w:val="0"/>
-                <w:sz w:val="20"/>
-                <w:szCs w:val="20"/>
-                <w14:ligatures w14:val="none"/>
-              </w:rPr>
-              <w:t>) Variables</w:t>
+              <w:t>MERRAclim-2 (MC) Variables</w:t>
             </w:r>
           </w:p>
         </w:tc>
@@ -4419,33 +4279,7 @@
                 <w:sz w:val="18"/>
                 <w:szCs w:val="18"/>
               </w:rPr>
-              <w:t xml:space="preserve">Details about the MERRA-2 collection </w:t>
-            </w:r>
-            <w:r>
-              <w:rPr>
-                <w:rFonts w:ascii="Times New Roman" w:hAnsi="Times New Roman" w:cs="Times New Roman"/>
-                <w:sz w:val="18"/>
-                <w:szCs w:val="18"/>
-              </w:rPr>
-              <w:t xml:space="preserve">can be found in: </w:t>
-            </w:r>
-            <w:proofErr w:type="spellStart"/>
-            <w:r>
-              <w:rPr>
-                <w:rFonts w:ascii="Times New Roman" w:hAnsi="Times New Roman" w:cs="Times New Roman"/>
-                <w:sz w:val="18"/>
-                <w:szCs w:val="18"/>
-              </w:rPr>
-              <w:t>Bosilovich</w:t>
-            </w:r>
-            <w:proofErr w:type="spellEnd"/>
-            <w:r>
-              <w:rPr>
-                <w:rFonts w:ascii="Times New Roman" w:hAnsi="Times New Roman" w:cs="Times New Roman"/>
-                <w:sz w:val="18"/>
-                <w:szCs w:val="18"/>
-              </w:rPr>
-              <w:t xml:space="preserve">, M.G., R. Lucchesi, and M. Suarez. 2016. “MERRA-2: File Specification.” </w:t>
+              <w:t xml:space="preserve">Details about the MERRA-2 collection can be found in: Bosilovich, M.G., R. Lucchesi, and M. Suarez. 2016. “MERRA-2: File Specification.” </w:t>
             </w:r>
             <w:r>
               <w:rPr>

</xml_diff>

<commit_message>
Remove trailing blank page from the variables appendix
Bottom margin reduced so the trailing paragraph no longer spills onto a
second page, which had been adding a blank page to every report.

Co-Authored-By: Claude Opus 5 <noreply@anthropic.com>
</commit_message>
<xml_diff>
--- a/inst/resources/variables.docx
+++ b/inst/resources/variables.docx
@@ -1,6 +1,6 @@
 
 <file path=word/document.xml><?xml version="1.0" encoding="utf-8"?>
-<w:document xmlns:wpc="http://schemas.microsoft.com/office/word/2010/wordprocessingCanvas" xmlns:cx="http://schemas.microsoft.com/office/drawing/2014/chartex" xmlns:cx1="http://schemas.microsoft.com/office/drawing/2015/9/8/chartex" xmlns:cx2="http://schemas.microsoft.com/office/drawing/2015/10/21/chartex" xmlns:cx3="http://schemas.microsoft.com/office/drawing/2016/5/9/chartex" xmlns:cx4="http://schemas.microsoft.com/office/drawing/2016/5/10/chartex" xmlns:cx5="http://schemas.microsoft.com/office/drawing/2016/5/11/chartex" xmlns:cx6="http://schemas.microsoft.com/office/drawing/2016/5/12/chartex" xmlns:cx7="http://schemas.microsoft.com/office/drawing/2016/5/13/chartex" xmlns:cx8="http://schemas.microsoft.com/office/drawing/2016/5/14/chartex" xmlns:mc="http://schemas.openxmlformats.org/markup-compatibility/2006" xmlns:m="http://schemas.openxmlformats.org/officeDocument/2006/math" xmlns:aink="http://schemas.microsoft.com/office/drawing/2016/ink" xmlns:am3d="http://schemas.microsoft.com/office/drawing/2017/model3d" xmlns:oel="http://schemas.microsoft.com/office/2019/extlst" xmlns:r="http://schemas.openxmlformats.org/officeDocument/2006/relationships" xmlns:wp14="http://schemas.microsoft.com/office/word/2010/wordprocessingDrawing" xmlns:wp="http://schemas.openxmlformats.org/drawingml/2006/wordprocessingDrawing" xmlns:wpg="http://schemas.microsoft.com/office/word/2010/wordprocessingGroup" xmlns:wpi="http://schemas.microsoft.com/office/word/2010/wordprocessingInk" xmlns:wps="http://schemas.microsoft.com/office/word/2010/wordprocessingShape" xmlns:o="urn:schemas-microsoft-com:office:office" xmlns:v="urn:schemas-microsoft-com:vml" xmlns:w10="urn:schemas-microsoft-com:office:word" xmlns:w="http://schemas.openxmlformats.org/wordprocessingml/2006/main" xmlns:w14="http://schemas.microsoft.com/office/word/2010/wordml" xmlns:w15="http://schemas.microsoft.com/office/word/2012/wordml" xmlns:w16cei="http://schemas.microsoft.com/office/word/2026/wordml/cei" xmlns:w16cex="http://schemas.microsoft.com/office/word/2018/wordml/cex" xmlns:w16cid="http://schemas.microsoft.com/office/word/2016/wordml/cid" xmlns:w16="http://schemas.microsoft.com/office/word/2018/wordml" xmlns:w16sdtdh="http://schemas.microsoft.com/office/word/2020/wordml/sdtdatahash" xmlns:w16sdtfl="http://schemas.microsoft.com/office/word/2024/wordml/sdtformatlock" xmlns:w16se="http://schemas.microsoft.com/office/word/2015/wordml/symex" xmlns:w16du="http://schemas.microsoft.com/office/word/2023/wordml/word16du" xmlns:wne="http://schemas.microsoft.com/office/word/2006/wordml" mc:Ignorable="w14 w15 w16se w16cid w16 w16cex w16sdtdh w16sdtfl w16du wp14">
+<w:document xmlns:wpc="http://schemas.microsoft.com/office/word/2010/wordprocessingCanvas" xmlns:cx="http://schemas.microsoft.com/office/drawing/2014/chartex" xmlns:cx1="http://schemas.microsoft.com/office/drawing/2015/9/8/chartex" xmlns:cx2="http://schemas.microsoft.com/office/drawing/2015/10/21/chartex" xmlns:cx3="http://schemas.microsoft.com/office/drawing/2016/5/9/chartex" xmlns:cx4="http://schemas.microsoft.com/office/drawing/2016/5/10/chartex" xmlns:cx5="http://schemas.microsoft.com/office/drawing/2016/5/11/chartex" xmlns:cx6="http://schemas.microsoft.com/office/drawing/2016/5/12/chartex" xmlns:cx7="http://schemas.microsoft.com/office/drawing/2016/5/13/chartex" xmlns:cx8="http://schemas.microsoft.com/office/drawing/2016/5/14/chartex" xmlns:mc="http://schemas.openxmlformats.org/markup-compatibility/2006" xmlns:m="http://schemas.openxmlformats.org/officeDocument/2006/math" xmlns:aink="http://schemas.microsoft.com/office/drawing/2016/ink" xmlns:am3d="http://schemas.microsoft.com/office/drawing/2017/model3d" xmlns:oel="http://schemas.microsoft.com/office/2019/extlst" xmlns:r="http://schemas.openxmlformats.org/officeDocument/2006/relationships" xmlns:wp14="http://schemas.microsoft.com/office/word/2010/wordprocessingDrawing" xmlns:wp="http://schemas.openxmlformats.org/drawingml/2006/wordprocessingDrawing" xmlns:wpg="http://schemas.microsoft.com/office/word/2010/wordprocessingGroup" xmlns:wpi="http://schemas.microsoft.com/office/word/2010/wordprocessingInk" xmlns:wps="http://schemas.microsoft.com/office/word/2010/wordprocessingShape" xmlns:o="urn:schemas-microsoft-com:office:office" xmlns:v="urn:schemas-microsoft-com:vml" xmlns:w10="urn:schemas-microsoft-com:office:word" xmlns:w="http://schemas.openxmlformats.org/wordprocessingml/2006/main" xmlns:w14="http://schemas.microsoft.com/office/word/2010/wordml" xmlns:w15="http://schemas.microsoft.com/office/word/2012/wordml" xmlns:w16cex="http://schemas.microsoft.com/office/word/2018/wordml/cex" xmlns:w16cid="http://schemas.microsoft.com/office/word/2016/wordml/cid" xmlns:w16="http://schemas.microsoft.com/office/word/2018/wordml" xmlns:w16sdtdh="http://schemas.microsoft.com/office/word/2020/wordml/sdtdatahash" xmlns:w16sdtfl="http://schemas.microsoft.com/office/word/2024/wordml/sdtformatlock" xmlns:w16se="http://schemas.microsoft.com/office/word/2015/wordml/symex" xmlns:w16du="http://schemas.microsoft.com/office/word/2023/wordml/word16du" xmlns:wne="http://schemas.microsoft.com/office/word/2006/wordml" mc:Ignorable="w14 w15 w16se w16cid w16 w16cex w16sdtdh w16sdtfl w16du wp14">
   <w:body>
     <w:tbl>
       <w:tblPr>
@@ -52,7 +52,7 @@
                 <w:sz w:val="21"/>
                 <w:szCs w:val="21"/>
               </w:rPr>
-              <w:t xml:space="preserve">MERRA-2 and MERRAclim-2 variables in the extended dataset.</w:t>
+              <w:t>MERRA-2 and MERRAclim-2 variables in the extended dataset.</w:t>
             </w:r>
           </w:p>
         </w:tc>
@@ -4315,7 +4315,7 @@
     </w:p>
     <w:sectPr>
       <w:pgSz w:w="12240" w:h="15840"/>
-      <w:pgMar w:top="1440" w:right="1440" w:bottom="1152" w:left="1440" w:header="720" w:footer="720" w:gutter="0"/>
+      <w:pgMar w:top="1440" w:right="1440" w:bottom="1008" w:left="1440" w:header="720" w:footer="720" w:gutter="0"/>
       <w:cols w:space="720"/>
       <w:docGrid w:linePitch="360"/>
     </w:sectPr>
@@ -4324,7 +4324,7 @@
 </file>
 
 <file path=word/endnotes.xml><?xml version="1.0" encoding="utf-8"?>
-<w:endnotes xmlns:wpc="http://schemas.microsoft.com/office/word/2010/wordprocessingCanvas" xmlns:cx="http://schemas.microsoft.com/office/drawing/2014/chartex" xmlns:cx1="http://schemas.microsoft.com/office/drawing/2015/9/8/chartex" xmlns:cx2="http://schemas.microsoft.com/office/drawing/2015/10/21/chartex" xmlns:cx3="http://schemas.microsoft.com/office/drawing/2016/5/9/chartex" xmlns:cx4="http://schemas.microsoft.com/office/drawing/2016/5/10/chartex" xmlns:cx5="http://schemas.microsoft.com/office/drawing/2016/5/11/chartex" xmlns:cx6="http://schemas.microsoft.com/office/drawing/2016/5/12/chartex" xmlns:cx7="http://schemas.microsoft.com/office/drawing/2016/5/13/chartex" xmlns:cx8="http://schemas.microsoft.com/office/drawing/2016/5/14/chartex" xmlns:mc="http://schemas.openxmlformats.org/markup-compatibility/2006" xmlns:m="http://schemas.openxmlformats.org/officeDocument/2006/math" xmlns:aink="http://schemas.microsoft.com/office/drawing/2016/ink" xmlns:am3d="http://schemas.microsoft.com/office/drawing/2017/model3d" xmlns:oel="http://schemas.microsoft.com/office/2019/extlst" xmlns:r="http://schemas.openxmlformats.org/officeDocument/2006/relationships" xmlns:wp14="http://schemas.microsoft.com/office/word/2010/wordprocessingDrawing" xmlns:wp="http://schemas.openxmlformats.org/drawingml/2006/wordprocessingDrawing" xmlns:wpg="http://schemas.microsoft.com/office/word/2010/wordprocessingGroup" xmlns:wpi="http://schemas.microsoft.com/office/word/2010/wordprocessingInk" xmlns:wps="http://schemas.microsoft.com/office/word/2010/wordprocessingShape" xmlns:o="urn:schemas-microsoft-com:office:office" xmlns:v="urn:schemas-microsoft-com:vml" xmlns:w10="urn:schemas-microsoft-com:office:word" xmlns:w="http://schemas.openxmlformats.org/wordprocessingml/2006/main" xmlns:w14="http://schemas.microsoft.com/office/word/2010/wordml" xmlns:w15="http://schemas.microsoft.com/office/word/2012/wordml" xmlns:w16cei="http://schemas.microsoft.com/office/word/2026/wordml/cei" xmlns:w16cex="http://schemas.microsoft.com/office/word/2018/wordml/cex" xmlns:w16cid="http://schemas.microsoft.com/office/word/2016/wordml/cid" xmlns:w16="http://schemas.microsoft.com/office/word/2018/wordml" xmlns:w16sdtdh="http://schemas.microsoft.com/office/word/2020/wordml/sdtdatahash" xmlns:w16sdtfl="http://schemas.microsoft.com/office/word/2024/wordml/sdtformatlock" xmlns:w16se="http://schemas.microsoft.com/office/word/2015/wordml/symex" xmlns:w16du="http://schemas.microsoft.com/office/word/2023/wordml/word16du" xmlns:wne="http://schemas.microsoft.com/office/word/2006/wordml" mc:Ignorable="w14 w15 w16se w16cid w16 w16cex w16sdtdh w16sdtfl w16du wp14">
+<w:endnotes xmlns:wpc="http://schemas.microsoft.com/office/word/2010/wordprocessingCanvas" xmlns:cx="http://schemas.microsoft.com/office/drawing/2014/chartex" xmlns:cx1="http://schemas.microsoft.com/office/drawing/2015/9/8/chartex" xmlns:cx2="http://schemas.microsoft.com/office/drawing/2015/10/21/chartex" xmlns:cx3="http://schemas.microsoft.com/office/drawing/2016/5/9/chartex" xmlns:cx4="http://schemas.microsoft.com/office/drawing/2016/5/10/chartex" xmlns:cx5="http://schemas.microsoft.com/office/drawing/2016/5/11/chartex" xmlns:cx6="http://schemas.microsoft.com/office/drawing/2016/5/12/chartex" xmlns:cx7="http://schemas.microsoft.com/office/drawing/2016/5/13/chartex" xmlns:cx8="http://schemas.microsoft.com/office/drawing/2016/5/14/chartex" xmlns:mc="http://schemas.openxmlformats.org/markup-compatibility/2006" xmlns:m="http://schemas.openxmlformats.org/officeDocument/2006/math" xmlns:aink="http://schemas.microsoft.com/office/drawing/2016/ink" xmlns:am3d="http://schemas.microsoft.com/office/drawing/2017/model3d" xmlns:oel="http://schemas.microsoft.com/office/2019/extlst" xmlns:r="http://schemas.openxmlformats.org/officeDocument/2006/relationships" xmlns:wp14="http://schemas.microsoft.com/office/word/2010/wordprocessingDrawing" xmlns:wp="http://schemas.openxmlformats.org/drawingml/2006/wordprocessingDrawing" xmlns:wpg="http://schemas.microsoft.com/office/word/2010/wordprocessingGroup" xmlns:wpi="http://schemas.microsoft.com/office/word/2010/wordprocessingInk" xmlns:wps="http://schemas.microsoft.com/office/word/2010/wordprocessingShape" xmlns:o="urn:schemas-microsoft-com:office:office" xmlns:v="urn:schemas-microsoft-com:vml" xmlns:w10="urn:schemas-microsoft-com:office:word" xmlns:w="http://schemas.openxmlformats.org/wordprocessingml/2006/main" xmlns:w14="http://schemas.microsoft.com/office/word/2010/wordml" xmlns:w15="http://schemas.microsoft.com/office/word/2012/wordml" xmlns:w16cex="http://schemas.microsoft.com/office/word/2018/wordml/cex" xmlns:w16cid="http://schemas.microsoft.com/office/word/2016/wordml/cid" xmlns:w16="http://schemas.microsoft.com/office/word/2018/wordml" xmlns:w16sdtdh="http://schemas.microsoft.com/office/word/2020/wordml/sdtdatahash" xmlns:w16sdtfl="http://schemas.microsoft.com/office/word/2024/wordml/sdtformatlock" xmlns:w16se="http://schemas.microsoft.com/office/word/2015/wordml/symex" xmlns:w16du="http://schemas.microsoft.com/office/word/2023/wordml/word16du" xmlns:wne="http://schemas.microsoft.com/office/word/2006/wordml" mc:Ignorable="w14 w15 w16se w16cid w16 w16cex w16sdtdh w16sdtfl w16du wp14">
   <w:endnote w:type="separator" w:id="-1">
     <w:p>
       <w:pPr>
@@ -4349,7 +4349,7 @@
 </file>
 
 <file path=word/footnotes.xml><?xml version="1.0" encoding="utf-8"?>
-<w:footnotes xmlns:wpc="http://schemas.microsoft.com/office/word/2010/wordprocessingCanvas" xmlns:cx="http://schemas.microsoft.com/office/drawing/2014/chartex" xmlns:cx1="http://schemas.microsoft.com/office/drawing/2015/9/8/chartex" xmlns:cx2="http://schemas.microsoft.com/office/drawing/2015/10/21/chartex" xmlns:cx3="http://schemas.microsoft.com/office/drawing/2016/5/9/chartex" xmlns:cx4="http://schemas.microsoft.com/office/drawing/2016/5/10/chartex" xmlns:cx5="http://schemas.microsoft.com/office/drawing/2016/5/11/chartex" xmlns:cx6="http://schemas.microsoft.com/office/drawing/2016/5/12/chartex" xmlns:cx7="http://schemas.microsoft.com/office/drawing/2016/5/13/chartex" xmlns:cx8="http://schemas.microsoft.com/office/drawing/2016/5/14/chartex" xmlns:mc="http://schemas.openxmlformats.org/markup-compatibility/2006" xmlns:m="http://schemas.openxmlformats.org/officeDocument/2006/math" xmlns:aink="http://schemas.microsoft.com/office/drawing/2016/ink" xmlns:am3d="http://schemas.microsoft.com/office/drawing/2017/model3d" xmlns:oel="http://schemas.microsoft.com/office/2019/extlst" xmlns:r="http://schemas.openxmlformats.org/officeDocument/2006/relationships" xmlns:wp14="http://schemas.microsoft.com/office/word/2010/wordprocessingDrawing" xmlns:wp="http://schemas.openxmlformats.org/drawingml/2006/wordprocessingDrawing" xmlns:wpg="http://schemas.microsoft.com/office/word/2010/wordprocessingGroup" xmlns:wpi="http://schemas.microsoft.com/office/word/2010/wordprocessingInk" xmlns:wps="http://schemas.microsoft.com/office/word/2010/wordprocessingShape" xmlns:o="urn:schemas-microsoft-com:office:office" xmlns:v="urn:schemas-microsoft-com:vml" xmlns:w10="urn:schemas-microsoft-com:office:word" xmlns:w="http://schemas.openxmlformats.org/wordprocessingml/2006/main" xmlns:w14="http://schemas.microsoft.com/office/word/2010/wordml" xmlns:w15="http://schemas.microsoft.com/office/word/2012/wordml" xmlns:w16cei="http://schemas.microsoft.com/office/word/2026/wordml/cei" xmlns:w16cex="http://schemas.microsoft.com/office/word/2018/wordml/cex" xmlns:w16cid="http://schemas.microsoft.com/office/word/2016/wordml/cid" xmlns:w16="http://schemas.microsoft.com/office/word/2018/wordml" xmlns:w16sdtdh="http://schemas.microsoft.com/office/word/2020/wordml/sdtdatahash" xmlns:w16sdtfl="http://schemas.microsoft.com/office/word/2024/wordml/sdtformatlock" xmlns:w16se="http://schemas.microsoft.com/office/word/2015/wordml/symex" xmlns:w16du="http://schemas.microsoft.com/office/word/2023/wordml/word16du" xmlns:wne="http://schemas.microsoft.com/office/word/2006/wordml" mc:Ignorable="w14 w15 w16se w16cid w16 w16cex w16sdtdh w16sdtfl w16du wp14">
+<w:footnotes xmlns:wpc="http://schemas.microsoft.com/office/word/2010/wordprocessingCanvas" xmlns:cx="http://schemas.microsoft.com/office/drawing/2014/chartex" xmlns:cx1="http://schemas.microsoft.com/office/drawing/2015/9/8/chartex" xmlns:cx2="http://schemas.microsoft.com/office/drawing/2015/10/21/chartex" xmlns:cx3="http://schemas.microsoft.com/office/drawing/2016/5/9/chartex" xmlns:cx4="http://schemas.microsoft.com/office/drawing/2016/5/10/chartex" xmlns:cx5="http://schemas.microsoft.com/office/drawing/2016/5/11/chartex" xmlns:cx6="http://schemas.microsoft.com/office/drawing/2016/5/12/chartex" xmlns:cx7="http://schemas.microsoft.com/office/drawing/2016/5/13/chartex" xmlns:cx8="http://schemas.microsoft.com/office/drawing/2016/5/14/chartex" xmlns:mc="http://schemas.openxmlformats.org/markup-compatibility/2006" xmlns:m="http://schemas.openxmlformats.org/officeDocument/2006/math" xmlns:aink="http://schemas.microsoft.com/office/drawing/2016/ink" xmlns:am3d="http://schemas.microsoft.com/office/drawing/2017/model3d" xmlns:oel="http://schemas.microsoft.com/office/2019/extlst" xmlns:r="http://schemas.openxmlformats.org/officeDocument/2006/relationships" xmlns:wp14="http://schemas.microsoft.com/office/word/2010/wordprocessingDrawing" xmlns:wp="http://schemas.openxmlformats.org/drawingml/2006/wordprocessingDrawing" xmlns:wpg="http://schemas.microsoft.com/office/word/2010/wordprocessingGroup" xmlns:wpi="http://schemas.microsoft.com/office/word/2010/wordprocessingInk" xmlns:wps="http://schemas.microsoft.com/office/word/2010/wordprocessingShape" xmlns:o="urn:schemas-microsoft-com:office:office" xmlns:v="urn:schemas-microsoft-com:vml" xmlns:w10="urn:schemas-microsoft-com:office:word" xmlns:w="http://schemas.openxmlformats.org/wordprocessingml/2006/main" xmlns:w14="http://schemas.microsoft.com/office/word/2010/wordml" xmlns:w15="http://schemas.microsoft.com/office/word/2012/wordml" xmlns:w16cex="http://schemas.microsoft.com/office/word/2018/wordml/cex" xmlns:w16cid="http://schemas.microsoft.com/office/word/2016/wordml/cid" xmlns:w16="http://schemas.microsoft.com/office/word/2018/wordml" xmlns:w16sdtdh="http://schemas.microsoft.com/office/word/2020/wordml/sdtdatahash" xmlns:w16sdtfl="http://schemas.microsoft.com/office/word/2024/wordml/sdtformatlock" xmlns:w16se="http://schemas.microsoft.com/office/word/2015/wordml/symex" xmlns:w16du="http://schemas.microsoft.com/office/word/2023/wordml/word16du" xmlns:wne="http://schemas.microsoft.com/office/word/2006/wordml" mc:Ignorable="w14 w15 w16se w16cid w16 w16cex w16sdtdh w16sdtfl w16du wp14">
   <w:footnote w:type="separator" w:id="-1">
     <w:p>
       <w:pPr>

</xml_diff>